<commit_message>
Feature: QDCA editável com hierarquia de proteção CA e memorial alinhado.
Preserva disjuntores/bitolas do formulário no cálculo, corrige I projeto nominal e defaults de micro (MPPT), com changelog para rollback.

Co-authored-by: Cursor <cursoragent@cursor.com>
</commit_message>
<xml_diff>
--- a/templates/MEMORIAL_DESCRITIVO_marcadores.docx
+++ b/templates/MEMORIAL_DESCRITIVO_marcadores.docx
@@ -226,8 +226,9 @@
           <w:sz w:val="20"/>
           <w:szCs w:val="20"/>
         </w:rPr>
-        <w:t xml:space="preserve"> </w:t>
-      </w:r>
+        <w:t xml:space="preserve"> {</w:t>
+      </w:r>
+      <w:proofErr w:type="gramEnd"/>
       <w:r>
         <w:rPr>
           <w:rFonts w:ascii="Arial" w:hAnsi="Arial" w:cs="Arial"/>
@@ -235,26 +236,7 @@
           <w:sz w:val="20"/>
           <w:szCs w:val="20"/>
         </w:rPr>
-        <w:t>{</w:t>
-      </w:r>
-      <w:proofErr w:type="gramEnd"/>
-      <w:r>
-        <w:rPr>
-          <w:rFonts w:ascii="Arial" w:hAnsi="Arial" w:cs="Arial"/>
-          <w:b/>
-          <w:sz w:val="20"/>
-          <w:szCs w:val="20"/>
-        </w:rPr>
-        <w:t>{TIPO_LIGACAO}}</w:t>
-      </w:r>
-      <w:r>
-        <w:rPr>
-          <w:rFonts w:ascii="Arial" w:hAnsi="Arial" w:cs="Arial"/>
-          <w:b/>
-          <w:sz w:val="20"/>
-          <w:szCs w:val="20"/>
-        </w:rPr>
-        <w:t xml:space="preserve"> </w:t>
+        <w:t xml:space="preserve">{TIPO_LIGACAO}} </w:t>
       </w:r>
       <w:r>
         <w:rPr>
@@ -1383,45 +1365,14 @@
                 <w:lang w:eastAsia="pt-BR"/>
               </w:rPr>
             </w:pPr>
-            <w:proofErr w:type="spellStart"/>
-            <w:r>
-              <w:rPr>
-                <w:rFonts w:ascii="Arial" w:eastAsia="Times New Roman" w:hAnsi="Arial" w:cs="Arial"/>
-                <w:sz w:val="20"/>
-                <w:szCs w:val="20"/>
-                <w:lang w:eastAsia="pt-BR"/>
-              </w:rPr>
-              <w:t>International</w:t>
-            </w:r>
-            <w:proofErr w:type="spellEnd"/>
-            <w:r>
-              <w:rPr>
-                <w:rFonts w:ascii="Arial" w:eastAsia="Times New Roman" w:hAnsi="Arial" w:cs="Arial"/>
-                <w:sz w:val="20"/>
-                <w:szCs w:val="20"/>
-                <w:lang w:eastAsia="pt-BR"/>
-              </w:rPr>
-              <w:t xml:space="preserve"> </w:t>
-            </w:r>
-            <w:proofErr w:type="spellStart"/>
-            <w:r>
-              <w:rPr>
-                <w:rFonts w:ascii="Arial" w:eastAsia="Times New Roman" w:hAnsi="Arial" w:cs="Arial"/>
-                <w:sz w:val="20"/>
-                <w:szCs w:val="20"/>
-                <w:lang w:eastAsia="pt-BR"/>
-              </w:rPr>
-              <w:t>Electrotechnical</w:t>
-            </w:r>
-            <w:proofErr w:type="spellEnd"/>
-            <w:r>
-              <w:rPr>
-                <w:rFonts w:ascii="Arial" w:eastAsia="Times New Roman" w:hAnsi="Arial" w:cs="Arial"/>
-                <w:sz w:val="20"/>
-                <w:szCs w:val="20"/>
-                <w:lang w:eastAsia="pt-BR"/>
-              </w:rPr>
-              <w:t xml:space="preserve"> Commission</w:t>
+            <w:r>
+              <w:rPr>
+                <w:rFonts w:ascii="Arial" w:eastAsia="Times New Roman" w:hAnsi="Arial" w:cs="Arial"/>
+                <w:sz w:val="20"/>
+                <w:szCs w:val="20"/>
+                <w:lang w:eastAsia="pt-BR"/>
+              </w:rPr>
+              <w:t>International Electrotechnical Commission</w:t>
             </w:r>
           </w:p>
         </w:tc>
@@ -2664,7 +2615,6 @@
                 <w:lang w:eastAsia="pt-BR"/>
               </w:rPr>
             </w:pPr>
-            <w:proofErr w:type="spellStart"/>
             <w:r>
               <w:rPr>
                 <w:rFonts w:ascii="Arial" w:eastAsia="Times New Roman" w:hAnsi="Arial" w:cs="Arial"/>
@@ -2674,7 +2624,6 @@
               </w:rPr>
               <w:t>Pára-raio</w:t>
             </w:r>
-            <w:proofErr w:type="spellEnd"/>
           </w:p>
         </w:tc>
       </w:tr>
@@ -3799,7 +3748,6 @@
                 <w:lang w:eastAsia="pt-BR"/>
               </w:rPr>
             </w:pPr>
-            <w:proofErr w:type="spellStart"/>
             <w:r>
               <w:rPr>
                 <w:rFonts w:ascii="Arial" w:eastAsia="Times New Roman" w:hAnsi="Arial" w:cs="Arial"/>
@@ -3811,7 +3759,6 @@
               </w:rPr>
               <w:t>MicroGD</w:t>
             </w:r>
-            <w:proofErr w:type="spellEnd"/>
           </w:p>
         </w:tc>
         <w:tc>
@@ -4129,7 +4076,6 @@
                 <w:lang w:eastAsia="pt-BR"/>
               </w:rPr>
             </w:pPr>
-            <w:proofErr w:type="spellStart"/>
             <w:r>
               <w:rPr>
                 <w:rFonts w:ascii="Arial" w:eastAsia="Times New Roman" w:hAnsi="Arial" w:cs="Arial"/>
@@ -4141,7 +4087,6 @@
               </w:rPr>
               <w:t>kWp</w:t>
             </w:r>
-            <w:proofErr w:type="spellEnd"/>
           </w:p>
         </w:tc>
         <w:tc>
@@ -11260,7 +11205,7 @@
           <w:lang w:eastAsia="pt-BR"/>
         </w:rPr>
         <w:pict w14:anchorId="0C6C8710">
-          <v:rect id="_x0000_i1062" style="width:0;height:.75pt" o:hralign="center" o:hrstd="t" o:hrnoshade="t" o:hr="t" fillcolor="#404040" stroked="f"/>
+          <v:rect id="_x0000_i1025" style="width:0;height:.75pt" o:hralign="center" o:hrstd="t" o:hrnoshade="t" o:hr="t" fillcolor="#404040" stroked="f"/>
         </w:pict>
       </w:r>
     </w:p>
@@ -11562,11 +11507,13 @@
           <w:numId w:val="5"/>
         </w:numPr>
         <w:rPr>
+          <w:rFonts w:ascii="Arial" w:hAnsi="Arial" w:cs="Arial"/>
           <w:lang w:eastAsia="pt-BR"/>
         </w:rPr>
       </w:pPr>
       <w:r>
         <w:rPr>
+          <w:rFonts w:ascii="Arial" w:hAnsi="Arial" w:cs="Arial"/>
           <w:lang w:eastAsia="pt-BR"/>
         </w:rPr>
         <w:t>Tensão Nominal: 275 V (compatível com rede monofásica 220 V).</w:t>
@@ -11580,24 +11527,27 @@
           <w:numId w:val="5"/>
         </w:numPr>
         <w:rPr>
+          <w:rFonts w:ascii="Arial" w:hAnsi="Arial" w:cs="Arial"/>
           <w:lang w:eastAsia="pt-BR"/>
         </w:rPr>
       </w:pPr>
       <w:r>
         <w:rPr>
+          <w:rFonts w:ascii="Arial" w:hAnsi="Arial" w:cs="Arial"/>
           <w:lang w:eastAsia="pt-BR"/>
         </w:rPr>
-        <w:lastRenderedPageBreak/>
         <w:t xml:space="preserve">Capacidade de Descarga: 20 kA </w:t>
       </w:r>
       <w:r>
         <w:rPr>
+          <w:rFonts w:ascii="Arial" w:hAnsi="Arial" w:cs="Arial"/>
           <w:lang w:eastAsia="pt-BR"/>
         </w:rPr>
         <w:t xml:space="preserve">ou superior </w:t>
       </w:r>
       <w:r>
         <w:rPr>
+          <w:rFonts w:ascii="Arial" w:hAnsi="Arial" w:cs="Arial"/>
           <w:lang w:eastAsia="pt-BR"/>
         </w:rPr>
         <w:t>(proteção contra surtos atmosféricos e internos).</w:t>
@@ -11611,13 +11561,16 @@
           <w:numId w:val="5"/>
         </w:numPr>
         <w:rPr>
+          <w:rFonts w:ascii="Arial" w:hAnsi="Arial" w:cs="Arial"/>
           <w:lang w:eastAsia="pt-BR"/>
         </w:rPr>
       </w:pPr>
       <w:r>
         <w:rPr>
+          <w:rFonts w:ascii="Arial" w:hAnsi="Arial" w:cs="Arial"/>
           <w:lang w:eastAsia="pt-BR"/>
         </w:rPr>
+        <w:lastRenderedPageBreak/>
         <w:t>Instalação: Conectado ao QDCA, garantindo proteção do inversor e circuitos críticos.</w:t>
       </w:r>
     </w:p>
@@ -11629,11 +11582,13 @@
           <w:numId w:val="5"/>
         </w:numPr>
         <w:rPr>
+          <w:rFonts w:ascii="Arial" w:hAnsi="Arial" w:cs="Arial"/>
           <w:lang w:eastAsia="pt-BR"/>
         </w:rPr>
       </w:pPr>
       <w:r>
         <w:rPr>
+          <w:rFonts w:ascii="Arial" w:hAnsi="Arial" w:cs="Arial"/>
           <w:lang w:eastAsia="pt-BR"/>
         </w:rPr>
         <w:t>Norma de Referência: ABNT NBR 5419 (proteção contra descargas atmosféricas).</w:t>
@@ -11652,6 +11607,7 @@
       </w:pPr>
       <w:r>
         <w:rPr>
+          <w:rFonts w:ascii="Arial" w:hAnsi="Arial" w:cs="Arial"/>
           <w:lang w:eastAsia="pt-BR"/>
         </w:rPr>
         <w:t>Nota: O DPS foi selecionado para atender aos cenários de surto mais críticos previstos na região, conforme mapa de densidade de raios do INPE.</w:t>
@@ -11709,21 +11665,7 @@
         <w:rPr>
           <w:rFonts w:ascii="Arial" w:hAnsi="Arial" w:cs="Arial"/>
         </w:rPr>
-        <w:t>{{</w:t>
-      </w:r>
-      <w:proofErr w:type="spellStart"/>
-      <w:r>
-        <w:rPr>
-          <w:rFonts w:ascii="Arial" w:hAnsi="Arial" w:cs="Arial"/>
-        </w:rPr>
-        <w:t>Texto_caixa</w:t>
-      </w:r>
-      <w:proofErr w:type="spellEnd"/>
-      <w:r>
-        <w:rPr>
-          <w:rFonts w:ascii="Arial" w:hAnsi="Arial" w:cs="Arial"/>
-        </w:rPr>
-        <w:t>}}</w:t>
+        <w:t>{{TEXTO_CAIXA}}</w:t>
       </w:r>
     </w:p>
     <w:p>
@@ -12015,7 +11957,7 @@
           <w:sz w:val="20"/>
           <w:szCs w:val="20"/>
         </w:rPr>
-        <w:t>{{figura_caixa}}</w:t>
+        <w:t>{{FIGURA_CAIXA}}</w:t>
       </w:r>
     </w:p>
     <w:p>
@@ -12078,16 +12020,37 @@
       </w:r>
     </w:p>
     <w:p>
-      <w:r>
+      <w:pPr>
+        <w:rPr>
+          <w:rFonts w:ascii="Arial" w:hAnsi="Arial" w:cs="Arial"/>
+        </w:rPr>
+      </w:pPr>
+      <w:r>
+        <w:rPr>
+          <w:rFonts w:ascii="Arial" w:hAnsi="Arial" w:cs="Arial"/>
+        </w:rPr>
         <w:t>O ramal de entrada da unidade consumidora é constituído por:</w:t>
       </w:r>
     </w:p>
     <w:p>
-      <w:r>
+      <w:pPr>
+        <w:rPr>
+          <w:rFonts w:ascii="Arial" w:hAnsi="Arial" w:cs="Arial"/>
+        </w:rPr>
+      </w:pPr>
+      <w:r>
+        <w:rPr>
+          <w:rFonts w:ascii="Arial" w:hAnsi="Arial" w:cs="Arial"/>
+        </w:rPr>
         <w:t>{{DESCRICAO_CIRCUITO_PADRAO}}</w:t>
       </w:r>
     </w:p>
     <w:p>
+      <w:pPr>
+        <w:rPr>
+          <w:rFonts w:ascii="Arial" w:hAnsi="Arial" w:cs="Arial"/>
+        </w:rPr>
+      </w:pPr>
       <w:r>
         <w:rPr>
           <w:rStyle w:val="font-semibold"/>
@@ -12097,37 +12060,78 @@
       </w:r>
     </w:p>
     <w:p>
-      <w:r>
+      <w:pPr>
+        <w:rPr>
+          <w:rFonts w:ascii="Arial" w:hAnsi="Arial" w:cs="Arial"/>
+        </w:rPr>
+      </w:pPr>
+      <w:r>
+        <w:rPr>
+          <w:rFonts w:ascii="Arial" w:hAnsi="Arial" w:cs="Arial"/>
+        </w:rPr>
         <w:t xml:space="preserve">Fase: {{BITOLA_CABO_PADRAO}} por condutor, cobre, isolação PVC (conforme item 5.2.1 da </w:t>
       </w:r>
       <w:proofErr w:type="gramStart"/>
       <w:r>
+        <w:rPr>
+          <w:rFonts w:ascii="Arial" w:hAnsi="Arial" w:cs="Arial"/>
+        </w:rPr>
         <w:t>NT.00001.EQTL</w:t>
       </w:r>
       <w:proofErr w:type="gramEnd"/>
       <w:r>
+        <w:rPr>
+          <w:rFonts w:ascii="Arial" w:hAnsi="Arial" w:cs="Arial"/>
+        </w:rPr>
         <w:t>), totalizando {{QTD_CONDUTORES_FASE}} condutores fase.</w:t>
       </w:r>
     </w:p>
     <w:p>
-      <w:r>
+      <w:pPr>
+        <w:rPr>
+          <w:rFonts w:ascii="Arial" w:hAnsi="Arial" w:cs="Arial"/>
+        </w:rPr>
+      </w:pPr>
+      <w:r>
+        <w:rPr>
+          <w:rFonts w:ascii="Arial" w:hAnsi="Arial" w:cs="Arial"/>
+        </w:rPr>
         <w:t>Neutro: {{BITOLA_CABO_PADRAO}} (mesma bitola dos condutores fase, conforme NBR 5410 para circuitos trifásicos com seção até 25 mm²).</w:t>
       </w:r>
     </w:p>
     <w:p>
-      <w:r>
+      <w:pPr>
+        <w:rPr>
+          <w:rFonts w:ascii="Arial" w:hAnsi="Arial" w:cs="Arial"/>
+        </w:rPr>
+      </w:pPr>
+      <w:r>
+        <w:rPr>
+          <w:rFonts w:ascii="Arial" w:hAnsi="Arial" w:cs="Arial"/>
+        </w:rPr>
         <w:t xml:space="preserve">Tensão nominal: {{DESCRICAO_TENSAO_ATENDIMENTO}}, atendendo à tabela 5.1 da </w:t>
       </w:r>
       <w:proofErr w:type="gramStart"/>
       <w:r>
+        <w:rPr>
+          <w:rFonts w:ascii="Arial" w:hAnsi="Arial" w:cs="Arial"/>
+        </w:rPr>
         <w:t>NT.00001.EQTL</w:t>
       </w:r>
       <w:proofErr w:type="gramEnd"/>
       <w:r>
+        <w:rPr>
+          <w:rFonts w:ascii="Arial" w:hAnsi="Arial" w:cs="Arial"/>
+        </w:rPr>
         <w:t>.</w:t>
       </w:r>
     </w:p>
     <w:p>
+      <w:pPr>
+        <w:rPr>
+          <w:rFonts w:ascii="Arial" w:hAnsi="Arial" w:cs="Arial"/>
+        </w:rPr>
+      </w:pPr>
       <w:r>
         <w:rPr>
           <w:rStyle w:val="font-semibold"/>
@@ -12136,6 +12140,9 @@
         <w:t>• Proteção:</w:t>
       </w:r>
       <w:r>
+        <w:rPr>
+          <w:rFonts w:ascii="Arial" w:hAnsi="Arial" w:cs="Arial"/>
+        </w:rPr>
         <w:t> {{DESCRICAO_DISJUNTOR_PADRAO}} {{CORRENTE_ENTRADA}} A (curva {{CURVA_ATUACAO_DISJUNTOR}}), conforme item 6.2.4 da mesma norma.</w:t>
       </w:r>
     </w:p>
@@ -12876,67 +12883,6 @@
                 <w:rFonts w:ascii="Arial" w:hAnsi="Arial" w:cs="Arial"/>
               </w:rPr>
               <w:t>{{EFICIENCIA_MODULO}}</w:t>
-            </w:r>
-          </w:p>
-        </w:tc>
-      </w:tr>
-      <w:tr>
-        <w:trPr>
-          <w:tblCellSpacing w:w="15" w:type="dxa"/>
-        </w:trPr>
-        <w:tc>
-          <w:tcPr>
-            <w:tcW w:w="0" w:type="auto"/>
-            <w:vAlign w:val="center"/>
-            <w:hideMark/>
-          </w:tcPr>
-          <w:p>
-            <w:pPr>
-              <w:spacing w:after="0"/>
-              <w:rPr>
-                <w:rFonts w:ascii="Arial" w:hAnsi="Arial" w:cs="Arial"/>
-                <w:b/>
-                <w:bCs/>
-              </w:rPr>
-            </w:pPr>
-            <w:proofErr w:type="spellStart"/>
-            <w:r>
-              <w:rPr>
-                <w:rFonts w:ascii="Arial" w:hAnsi="Arial" w:cs="Arial"/>
-                <w:b/>
-                <w:bCs/>
-              </w:rPr>
-              <w:t>Bifacialidade</w:t>
-            </w:r>
-            <w:proofErr w:type="spellEnd"/>
-            <w:r>
-              <w:rPr>
-                <w:rFonts w:ascii="Arial" w:hAnsi="Arial" w:cs="Arial"/>
-                <w:b/>
-                <w:bCs/>
-              </w:rPr>
-              <w:t xml:space="preserve"> [%]</w:t>
-            </w:r>
-          </w:p>
-        </w:tc>
-        <w:tc>
-          <w:tcPr>
-            <w:tcW w:w="0" w:type="auto"/>
-            <w:vAlign w:val="center"/>
-            <w:hideMark/>
-          </w:tcPr>
-          <w:p>
-            <w:pPr>
-              <w:spacing w:after="0"/>
-              <w:rPr>
-                <w:rFonts w:ascii="Arial" w:hAnsi="Arial" w:cs="Arial"/>
-              </w:rPr>
-            </w:pPr>
-            <w:r>
-              <w:rPr>
-                <w:rFonts w:ascii="Arial" w:hAnsi="Arial" w:cs="Arial"/>
-              </w:rPr>
-              <w:t>{{BIFACIALIDADE_MODULO}}</w:t>
             </w:r>
           </w:p>
         </w:tc>
@@ -13972,7 +13918,6 @@
                 <w:rFonts w:ascii="Arial" w:eastAsia="Times New Roman" w:hAnsi="Arial" w:cs="Arial"/>
                 <w:lang w:eastAsia="pt-BR"/>
               </w:rPr>
-              <w:lastRenderedPageBreak/>
               <w:t>Potência total dos inversores [kW]</w:t>
             </w:r>
           </w:p>
@@ -14049,6 +13994,7 @@
                 <w:rFonts w:ascii="Arial" w:eastAsia="Times New Roman" w:hAnsi="Arial" w:cs="Arial"/>
                 <w:lang w:eastAsia="pt-BR"/>
               </w:rPr>
+              <w:lastRenderedPageBreak/>
               <w:t>Corrente de saída máx. [A]</w:t>
             </w:r>
           </w:p>
@@ -15238,7 +15184,6 @@
           <w:sz w:val="20"/>
           <w:szCs w:val="20"/>
         </w:rPr>
-        <w:lastRenderedPageBreak/>
         <w:t>DPS CA:</w:t>
       </w:r>
     </w:p>
@@ -15265,6 +15210,7 @@
           <w:sz w:val="20"/>
           <w:szCs w:val="20"/>
         </w:rPr>
+        <w:lastRenderedPageBreak/>
         <w:t>Tipo: CA</w:t>
       </w:r>
     </w:p>
@@ -15393,6 +15339,14 @@
         </w:rPr>
         <w:t>DIMENSIONAMENTO DOS CABOS</w:t>
       </w:r>
+    </w:p>
+    <w:p>
+      <w:pPr>
+        <w:pStyle w:val="PargrafodaLista"/>
+        <w:rPr>
+          <w:rFonts w:ascii="Arial" w:hAnsi="Arial" w:cs="Arial"/>
+        </w:rPr>
+      </w:pPr>
     </w:p>
     <w:p>
       <w:pPr>
@@ -15449,9 +15403,9 @@
         <w:tblLook w:val="04A0" w:firstRow="1" w:lastRow="0" w:firstColumn="1" w:lastColumn="0" w:noHBand="0" w:noVBand="1"/>
       </w:tblPr>
       <w:tblGrid>
-        <w:gridCol w:w="1703"/>
-        <w:gridCol w:w="3968"/>
-        <w:gridCol w:w="3968"/>
+        <w:gridCol w:w="2002"/>
+        <w:gridCol w:w="3824"/>
+        <w:gridCol w:w="3813"/>
       </w:tblGrid>
       <w:tr>
         <w:trPr>
@@ -15480,8 +15434,6 @@
               <w:spacing w:after="0" w:line="240" w:lineRule="auto"/>
               <w:rPr>
                 <w:rFonts w:ascii="Arial" w:eastAsia="Times New Roman" w:hAnsi="Arial" w:cs="Arial"/>
-                <w:b/>
-                <w:bCs/>
                 <w:sz w:val="20"/>
                 <w:szCs w:val="20"/>
                 <w:lang w:eastAsia="pt-BR"/>
@@ -15490,8 +15442,6 @@
             <w:r>
               <w:rPr>
                 <w:rFonts w:ascii="Arial" w:eastAsia="Times New Roman" w:hAnsi="Arial" w:cs="Arial"/>
-                <w:b/>
-                <w:bCs/>
                 <w:sz w:val="20"/>
                 <w:szCs w:val="20"/>
                 <w:lang w:eastAsia="pt-BR"/>
@@ -15523,8 +15473,6 @@
               <w:spacing w:after="0" w:line="240" w:lineRule="auto"/>
               <w:rPr>
                 <w:rFonts w:ascii="Arial" w:eastAsia="Times New Roman" w:hAnsi="Arial" w:cs="Arial"/>
-                <w:b/>
-                <w:bCs/>
                 <w:sz w:val="20"/>
                 <w:szCs w:val="20"/>
                 <w:lang w:eastAsia="pt-BR"/>
@@ -15533,8 +15481,6 @@
             <w:r>
               <w:rPr>
                 <w:rFonts w:ascii="Arial" w:eastAsia="Times New Roman" w:hAnsi="Arial" w:cs="Arial"/>
-                <w:b/>
-                <w:bCs/>
                 <w:sz w:val="20"/>
                 <w:szCs w:val="20"/>
                 <w:lang w:eastAsia="pt-BR"/>
@@ -15566,8 +15512,6 @@
               <w:spacing w:after="0" w:line="240" w:lineRule="auto"/>
               <w:rPr>
                 <w:rFonts w:ascii="Arial" w:eastAsia="Times New Roman" w:hAnsi="Arial" w:cs="Arial"/>
-                <w:b/>
-                <w:bCs/>
                 <w:sz w:val="20"/>
                 <w:szCs w:val="20"/>
                 <w:lang w:eastAsia="pt-BR"/>
@@ -15576,8 +15520,6 @@
             <w:r>
               <w:rPr>
                 <w:rFonts w:ascii="Arial" w:eastAsia="Times New Roman" w:hAnsi="Arial" w:cs="Arial"/>
-                <w:b/>
-                <w:bCs/>
                 <w:sz w:val="20"/>
                 <w:szCs w:val="20"/>
                 <w:lang w:eastAsia="pt-BR"/>
@@ -15614,8 +15556,6 @@
               <w:spacing w:after="0" w:line="240" w:lineRule="auto"/>
               <w:rPr>
                 <w:rFonts w:ascii="Arial" w:eastAsia="Times New Roman" w:hAnsi="Arial" w:cs="Arial"/>
-                <w:b/>
-                <w:bCs/>
                 <w:sz w:val="20"/>
                 <w:szCs w:val="20"/>
                 <w:lang w:eastAsia="pt-BR"/>
@@ -15624,8 +15564,6 @@
             <w:r>
               <w:rPr>
                 <w:rFonts w:ascii="Arial" w:eastAsia="Times New Roman" w:hAnsi="Arial" w:cs="Arial"/>
-                <w:b/>
-                <w:bCs/>
                 <w:sz w:val="20"/>
                 <w:szCs w:val="20"/>
                 <w:lang w:eastAsia="pt-BR"/>
@@ -15657,8 +15595,6 @@
               <w:spacing w:after="0" w:line="240" w:lineRule="auto"/>
               <w:rPr>
                 <w:rFonts w:ascii="Arial" w:eastAsia="Times New Roman" w:hAnsi="Arial" w:cs="Arial"/>
-                <w:b/>
-                <w:bCs/>
                 <w:sz w:val="20"/>
                 <w:szCs w:val="20"/>
                 <w:lang w:eastAsia="pt-BR"/>
@@ -15667,8 +15603,6 @@
             <w:r>
               <w:rPr>
                 <w:rFonts w:ascii="Arial" w:eastAsia="Times New Roman" w:hAnsi="Arial" w:cs="Arial"/>
-                <w:b/>
-                <w:bCs/>
                 <w:sz w:val="20"/>
                 <w:szCs w:val="20"/>
                 <w:lang w:eastAsia="pt-BR"/>
@@ -15700,8 +15634,6 @@
               <w:spacing w:after="0" w:line="240" w:lineRule="auto"/>
               <w:rPr>
                 <w:rFonts w:ascii="Arial" w:eastAsia="Times New Roman" w:hAnsi="Arial" w:cs="Arial"/>
-                <w:b/>
-                <w:bCs/>
                 <w:sz w:val="20"/>
                 <w:szCs w:val="20"/>
                 <w:lang w:eastAsia="pt-BR"/>
@@ -15710,8 +15642,6 @@
             <w:r>
               <w:rPr>
                 <w:rFonts w:ascii="Arial" w:eastAsia="Times New Roman" w:hAnsi="Arial" w:cs="Arial"/>
-                <w:b/>
-                <w:bCs/>
                 <w:sz w:val="20"/>
                 <w:szCs w:val="20"/>
                 <w:lang w:eastAsia="pt-BR"/>
@@ -15748,8 +15678,6 @@
               <w:spacing w:after="0" w:line="240" w:lineRule="auto"/>
               <w:rPr>
                 <w:rFonts w:ascii="Arial" w:eastAsia="Times New Roman" w:hAnsi="Arial" w:cs="Arial"/>
-                <w:b/>
-                <w:bCs/>
                 <w:sz w:val="20"/>
                 <w:szCs w:val="20"/>
                 <w:lang w:eastAsia="pt-BR"/>
@@ -15758,8 +15686,6 @@
             <w:r>
               <w:rPr>
                 <w:rFonts w:ascii="Arial" w:eastAsia="Times New Roman" w:hAnsi="Arial" w:cs="Arial"/>
-                <w:b/>
-                <w:bCs/>
                 <w:sz w:val="20"/>
                 <w:szCs w:val="20"/>
                 <w:lang w:eastAsia="pt-BR"/>
@@ -15791,8 +15717,6 @@
               <w:spacing w:after="0" w:line="240" w:lineRule="auto"/>
               <w:rPr>
                 <w:rFonts w:ascii="Arial" w:eastAsia="Times New Roman" w:hAnsi="Arial" w:cs="Arial"/>
-                <w:b/>
-                <w:bCs/>
                 <w:sz w:val="20"/>
                 <w:szCs w:val="20"/>
                 <w:lang w:eastAsia="pt-BR"/>
@@ -15801,8 +15725,6 @@
             <w:r>
               <w:rPr>
                 <w:rFonts w:ascii="Arial" w:eastAsia="Times New Roman" w:hAnsi="Arial" w:cs="Arial"/>
-                <w:b/>
-                <w:bCs/>
                 <w:sz w:val="20"/>
                 <w:szCs w:val="20"/>
                 <w:lang w:eastAsia="pt-BR"/>
@@ -15834,8 +15756,6 @@
               <w:spacing w:after="0" w:line="240" w:lineRule="auto"/>
               <w:rPr>
                 <w:rFonts w:ascii="Arial" w:eastAsia="Times New Roman" w:hAnsi="Arial" w:cs="Arial"/>
-                <w:b/>
-                <w:bCs/>
                 <w:sz w:val="20"/>
                 <w:szCs w:val="20"/>
                 <w:lang w:eastAsia="pt-BR"/>
@@ -15844,8 +15764,6 @@
             <w:r>
               <w:rPr>
                 <w:rFonts w:ascii="Arial" w:eastAsia="Times New Roman" w:hAnsi="Arial" w:cs="Arial"/>
-                <w:b/>
-                <w:bCs/>
                 <w:sz w:val="20"/>
                 <w:szCs w:val="20"/>
                 <w:lang w:eastAsia="pt-BR"/>
@@ -15882,8 +15800,6 @@
               <w:spacing w:after="0" w:line="240" w:lineRule="auto"/>
               <w:rPr>
                 <w:rFonts w:ascii="Arial" w:eastAsia="Times New Roman" w:hAnsi="Arial" w:cs="Arial"/>
-                <w:b/>
-                <w:bCs/>
                 <w:sz w:val="20"/>
                 <w:szCs w:val="20"/>
                 <w:lang w:eastAsia="pt-BR"/>
@@ -15892,8 +15808,6 @@
             <w:r>
               <w:rPr>
                 <w:rFonts w:ascii="Arial" w:eastAsia="Times New Roman" w:hAnsi="Arial" w:cs="Arial"/>
-                <w:b/>
-                <w:bCs/>
                 <w:sz w:val="20"/>
                 <w:szCs w:val="20"/>
                 <w:lang w:eastAsia="pt-BR"/>
@@ -15925,8 +15839,6 @@
               <w:spacing w:after="0" w:line="240" w:lineRule="auto"/>
               <w:rPr>
                 <w:rFonts w:ascii="Arial" w:eastAsia="Times New Roman" w:hAnsi="Arial" w:cs="Arial"/>
-                <w:b/>
-                <w:bCs/>
                 <w:sz w:val="20"/>
                 <w:szCs w:val="20"/>
                 <w:lang w:eastAsia="pt-BR"/>
@@ -15935,8 +15847,6 @@
             <w:r>
               <w:rPr>
                 <w:rFonts w:ascii="Arial" w:eastAsia="Times New Roman" w:hAnsi="Arial" w:cs="Arial"/>
-                <w:b/>
-                <w:bCs/>
                 <w:sz w:val="20"/>
                 <w:szCs w:val="20"/>
                 <w:lang w:eastAsia="pt-BR"/>
@@ -15968,8 +15878,6 @@
               <w:spacing w:after="0" w:line="240" w:lineRule="auto"/>
               <w:rPr>
                 <w:rFonts w:ascii="Arial" w:eastAsia="Times New Roman" w:hAnsi="Arial" w:cs="Arial"/>
-                <w:b/>
-                <w:bCs/>
                 <w:sz w:val="20"/>
                 <w:szCs w:val="20"/>
                 <w:lang w:eastAsia="pt-BR"/>
@@ -15978,8 +15886,6 @@
             <w:r>
               <w:rPr>
                 <w:rFonts w:ascii="Arial" w:eastAsia="Times New Roman" w:hAnsi="Arial" w:cs="Arial"/>
-                <w:b/>
-                <w:bCs/>
                 <w:sz w:val="20"/>
                 <w:szCs w:val="20"/>
                 <w:lang w:eastAsia="pt-BR"/>
@@ -16016,8 +15922,6 @@
               <w:spacing w:after="0" w:line="240" w:lineRule="auto"/>
               <w:rPr>
                 <w:rFonts w:ascii="Arial" w:eastAsia="Times New Roman" w:hAnsi="Arial" w:cs="Arial"/>
-                <w:b/>
-                <w:bCs/>
                 <w:sz w:val="20"/>
                 <w:szCs w:val="20"/>
                 <w:lang w:eastAsia="pt-BR"/>
@@ -16026,8 +15930,6 @@
             <w:r>
               <w:rPr>
                 <w:rFonts w:ascii="Arial" w:eastAsia="Times New Roman" w:hAnsi="Arial" w:cs="Arial"/>
-                <w:b/>
-                <w:bCs/>
                 <w:sz w:val="20"/>
                 <w:szCs w:val="20"/>
                 <w:lang w:eastAsia="pt-BR"/>
@@ -16059,8 +15961,6 @@
               <w:spacing w:after="0" w:line="240" w:lineRule="auto"/>
               <w:rPr>
                 <w:rFonts w:ascii="Arial" w:eastAsia="Times New Roman" w:hAnsi="Arial" w:cs="Arial"/>
-                <w:b/>
-                <w:bCs/>
                 <w:sz w:val="20"/>
                 <w:szCs w:val="20"/>
                 <w:lang w:eastAsia="pt-BR"/>
@@ -16069,8 +15969,6 @@
             <w:r>
               <w:rPr>
                 <w:rFonts w:ascii="Arial" w:eastAsia="Times New Roman" w:hAnsi="Arial" w:cs="Arial"/>
-                <w:b/>
-                <w:bCs/>
                 <w:sz w:val="20"/>
                 <w:szCs w:val="20"/>
                 <w:lang w:eastAsia="pt-BR"/>
@@ -16102,8 +16000,6 @@
               <w:spacing w:after="0" w:line="240" w:lineRule="auto"/>
               <w:rPr>
                 <w:rFonts w:ascii="Arial" w:eastAsia="Times New Roman" w:hAnsi="Arial" w:cs="Arial"/>
-                <w:b/>
-                <w:bCs/>
                 <w:sz w:val="20"/>
                 <w:szCs w:val="20"/>
                 <w:lang w:eastAsia="pt-BR"/>
@@ -16112,8 +16008,6 @@
             <w:r>
               <w:rPr>
                 <w:rFonts w:ascii="Arial" w:eastAsia="Times New Roman" w:hAnsi="Arial" w:cs="Arial"/>
-                <w:b/>
-                <w:bCs/>
                 <w:sz w:val="20"/>
                 <w:szCs w:val="20"/>
                 <w:lang w:eastAsia="pt-BR"/>
@@ -16657,7 +16551,6 @@
           <w:sz w:val="20"/>
           <w:szCs w:val="20"/>
         </w:rPr>
-        <w:lastRenderedPageBreak/>
         <w:t>PLACA DE ADVERTÊNCIA</w:t>
       </w:r>
       <w:bookmarkEnd w:id="22"/>
@@ -16682,6 +16575,7 @@
           <w:sz w:val="20"/>
           <w:szCs w:val="20"/>
         </w:rPr>
+        <w:lastRenderedPageBreak/>
         <w:t>Descrever forma e local de instalação, conforme modelo abaixo:</w:t>
       </w:r>
     </w:p>
@@ -24233,6 +24127,7 @@
   <w:style w:type="character" w:default="1" w:styleId="Fontepargpadro">
     <w:name w:val="Default Paragraph Font"/>
     <w:uiPriority w:val="1"/>
+    <w:semiHidden/>
     <w:unhideWhenUsed/>
   </w:style>
   <w:style w:type="table" w:default="1" w:styleId="Tabelanormal">

</xml_diff>